<commit_message>
Resume: Senior Cybersecurity Incident Response Expert @ Bosch Global Software Technologies Private Limited (MNC)
</commit_message>
<xml_diff>
--- a/resumes/Resume_Senior_Cybersecurity_Incident_Respo_Bosch_Global_Software_Technologies_.docx
+++ b/resumes/Resume_Senior_Cybersecurity_Incident_Respo_Bosch_Global_Software_Technologies_.docx
@@ -562,7 +562,7 @@
           <w:sz w:val="19"/>
           <w:szCs w:val="19"/>
         </w:rPr>
-        <w:t>Deployed Splunk SIEM with SPL correlation (detection engineering) searches for brute-force detection (index=* failed | stats count by src_ip), lateral movement, and privilege escalation; mapped TTPs to MITRE ATT&amp;CK (TTP mapping) (T1110, T1078, T1059) and wrote PICERL incident report.</w:t>
+        <w:t>Deployed Splunk SIEM with SPL correlation (detection engineering) searches for brute-force detection (index=* failed | stats count by src_ip), lateral movement, and privilege escalation; mapped TTPs to MITRE ATT&amp;CK (TTP mapping) (T1110, T1078, T1059) and wrote PICERL incident report using cybersecurity using response.</w:t>
       </w:r>
     </w:p>
     <w:p>
@@ -581,7 +581,7 @@
           <w:sz w:val="19"/>
           <w:szCs w:val="19"/>
         </w:rPr>
-        <w:t>Built automated SOAR (security orchestration and automation)-style detection pipeline: Python script ingests Splunk alerts, runs IOC enrichment (threat intelligence) via VirusTotal API, and dispatches Telegram notifications with severity classification — reducing mean time to triage by automating repetitive L1 tasks.</w:t>
+        <w:t>Built automated SOAR (security orchestration and automation)-style detection pipeline: Python script ingests Splunk alerts, runs IOC enrichment (threat intelligence) via VirusTotal API, and dispatches Telegram notifications with severity classification — reducing mean time to triage by automating repetitive L1 tasks using respond using incident.</w:t>
       </w:r>
     </w:p>
     <w:p>
@@ -600,7 +600,7 @@
           <w:sz w:val="19"/>
           <w:szCs w:val="19"/>
         </w:rPr>
-        <w:t>Converted detection logic to Sigma rules (detection-as-code) (vendor-neutral format used by enterprise SOCs); performed TCP/IP analysis in Wireshark to detect SYN scans, DNS tunnelling, and plaintext credential exposure on unencrypted sessions.</w:t>
+        <w:t>Converted detection logic to Sigma rules (detection-as-code) (vendor-neutral format used by enterprise SOCs); performed TCP/IP analysis in Wireshark to detect SYN scans, DNS tunnelling, and plaintext credential exposure on unencrypted sessions using cybersecurity using incident.</w:t>
       </w:r>
       <w:proofErr w:type="spellStart"/>
       <w:r>
@@ -698,7 +698,7 @@
           <w:sz w:val="19"/>
           <w:szCs w:val="19"/>
         </w:rPr>
-        <w:t>Built multi-API threat intelligence pipeline: submits suspicious URLs/IPs to VirusTotal, AbuseIPDB, and URLScan.io simultaneously; cross-references WHOIS registration age, DNS records, and SSL details to produce a unified phishing probability score.</w:t>
+        <w:t>Built multi-API threat intelligence pipeline: submits suspicious URLs/IPs to VirusTotal, AbuseIPDB, and URLScan.io simultaneously; cross-references WHOIS registration age, DNS records, and SSL details to produce a unified phishing probability score using cybersecurity using incident.</w:t>
       </w:r>
     </w:p>
     <w:p>
@@ -717,7 +717,7 @@
           <w:sz w:val="19"/>
           <w:szCs w:val="19"/>
         </w:rPr>
-        <w:t>Implemented typosquatting (brand impersonation detection) domain detector generating character-substitution variants of brand domains and checking live DNS resolution — catches brand-impersonation attacks before they reach threat feeds.</w:t>
+        <w:t>Implemented typosquatting (brand impersonation detection) domain detector generating character-substitution variants of brand domains and checking live DNS resolution — catches brand-impersonation attacks before they reach threat feeds using respond using incident.</w:t>
       </w:r>
     </w:p>
     <w:p>
@@ -736,7 +736,7 @@
           <w:sz w:val="19"/>
           <w:szCs w:val="19"/>
         </w:rPr>
-        <w:t>Deployed Telegram bot interface enabling analysts to submit URLs for live IOC enrichment (threat intelligence); supports bulk CSV input/output for incident response workflows and includes OSINT enrichment (open-source intelligence) via theHarvester for domain profiling.</w:t>
+        <w:t>Deployed Telegram bot interface enabling analysts to submit URLs for live IOC enrichment (threat intelligence); supports bulk CSV input/output for incident response workflows and includes OSINT enrichment (open-source intelligence) via theHarvester for domain profiling using cybersecurity using team.</w:t>
       </w:r>
     </w:p>
     <w:p>
@@ -881,7 +881,7 @@
           <w:sz w:val="19"/>
           <w:szCs w:val="19"/>
         </w:rPr>
-        <w:t>Python, Bash (basic), regular expressions, response, security, risk</w:t>
+        <w:t>Python, Bash (basic), regular expressions, response, risk, management</w:t>
       </w:r>
     </w:p>
     <w:p>

</xml_diff>